<commit_message>
Document shared map filtering behavior
Clarify that map pins follow active contact-list search and filters.

Co-authored-by: Copilot <223556219+Copilot@users.noreply.github.com>
</commit_message>
<xml_diff>
--- a/Return Visits & Contacts App Specification (V6).docx
+++ b/Return Visits & Contacts App Specification (V6).docx
@@ -222,13 +222,13 @@
     <w:p>
       <w:pPr/>
       <w:r>
-        <w:t>A contact can be saved without coordinates. When present, valid coordinates allow it to appear on the map; pins are colored by urgency, the viewport fits available markers, and each marker opens an informational popup with an Edit Details action.</w:t>
-      </w:r>
-    </w:p>
-    <w:p>
-      <w:pPr/>
-      <w:r>
-        <w:t>Map clustering, hierarchical map filters, offline tiles, and offline geocoding are not implemented. Device GPS requires browser permission; address search, Leaflet assets, and OpenStreetMap tiles require internet access.</w:t>
+        <w:t>A contact can be saved without coordinates. When present, valid coordinates allow it to appear on the map; pins are colored by urgency, the viewport fits available markers, and each marker opens an informational popup with an Edit Details action. The map uses the same active search and filters as the contact list (text, urgency, city, region, and area), so only matching contacts with coordinates have pins. Changing a search or filter updates both the contact list and map.</w:t>
+      </w:r>
+    </w:p>
+    <w:p>
+      <w:pPr/>
+      <w:r>
+        <w:t>The map has no separate map-only filters or marker clustering; it follows the shared contact-list search and filters. Device GPS requires browser permission; address search, Leaflet assets, and OpenStreetMap tiles require internet access. Map tiles and address lookup are unavailable offline.</w:t>
       </w:r>
     </w:p>
     <w:p>

</xml_diff>